<commit_message>
Expand paper: cross-domain comparison with drone-ecology-forecast (Table III), Croatian perspective subsection, renamed discussion headings, new ref [20] (Zenodo DOI of companion study); EN+HR now 6 pages
</commit_message>
<xml_diff>
--- a/paper/MIPRO_Drones_Agriculture_Forecast.docx
+++ b/paper/MIPRO_Drones_Agriculture_Forecast.docx
@@ -105,7 +105,7 @@
       </w:r>
       <w:r>
         <w:rPr/>
-        <w:t xml:space="preserve">—Unmanned aerial vehicles (UAVs) are promoted as a cornerstone of precision agriculture, both as sensing platforms and, increasingly, as actuators for spraying, yet the pace and the likely saturation of this adoption have not been quantified. We compiled annual counts of peer-reviewed articles combining UAV terms with agricultural terms from the open bibliographic index OpenAlex for 2005 to 2025 (18,506 articles after noise filtering), together with four normalising denominators and seven application sub-domains, and fitted four growth models (exponential, logistic, Gompertz and Bass diffusion) by Poisson deviance in a toolbox-free MATLAB pipeline. Models were compared with a quasi-likelihood information criterion, validated by rolling-origin backtesting and bootstrapped for forecast intervals. Output grew at 28.5 percent per year (29 articles in 2005, 4,381 in 2025), with a structural break in 2009. No model dominates for absolute output: the model average predicts 8,174 articles in 2028 and 40,260 in 2035, with a ten-year interval of 13,390 to 55,050. The share of the agricultural literature that uses UAVs is saturating later than in neighbouring fields: a logistic model with weight 0.91 gives a plateau of 13.8 articles per 1,000, of which 62 percent was reached in 2025. Growth is fastest in yield prediction, irrigation and disease detection, while spraying makes the UAV an actuator with distinct regulatory constraints. Implications for UAV design and autonomy are discussed.</w:t>
+        <w:t xml:space="preserve">—Unmanned aerial vehicles (UAVs) are promoted as a cornerstone of precision agriculture, both as sensing platforms and, increasingly, as actuators for spraying, yet the pace and the likely saturation of this adoption have not been quantified. We compiled annual counts of peer-reviewed articles combining UAV terms with agricultural terms from the open bibliographic index OpenAlex for 2005 to 2025 (18,506 articles after noise filtering), together with four normalising denominators and seven application sub-domains, and fitted four growth models (exponential, logistic, Gompertz and Bass diffusion) by Poisson deviance in a toolbox-free MATLAB pipeline. Models were compared with a quasi-likelihood information criterion, validated by rolling-origin backtesting and bootstrapped for forecast intervals. Output grew at 28.5 percent per year (29 articles in 2005, 4,381 in 2025), with a structural break in 2009. No model dominates for absolute output: the model average predicts 8,174 articles in 2028 and 40,260 in 2035, with a ten-year interval of 13,390 to 55,050. The share of the agricultural literature that uses UAVs is saturating later than in neighbouring fields: a logistic model with weight 0.91 gives a plateau of 13.8 articles per 1,000, of which 62 percent was reached in 2025. A like-for-like comparison with our companion study of UAVs in environmental monitoring, produced with the identical pipeline, places agriculture about four years earlier on the same adoption curve. Growth is fastest in yield prediction, irrigation and disease detection, while spraying makes the UAV an actuator with distinct regulatory constraints. Implications for UAV design and autonomy are discussed.</w:t>
       </w:r>
     </w:p>
     <w:p>
@@ -145,7 +145,7 @@
       </w:pPr>
       <w:r>
         <w:rPr/>
-        <w:t xml:space="preserve">This paper answers both questions with a reproducible bibliometric time series and a transparent forecasting pipeline, applying the methodology we developed for UAVs in ecology and environmental monitoring to the agricultural domain. Our contributions are: (i) an openly queryable annual data set (2005–2025) of UAV research in agriculture, with a documented noise filter, four denominators and seven application sub-domains, built from the OpenAlex index [4]; (ii) a description of the current state of the field, including trend tests, a structural break and the distribution of output over sub-domains, countries and venues; (iii) a MATLAB algorithm, free of toolbox dependencies, that fits and compares four classical growth models, validates them out of sample and produces bootstrapped forecasts for 3, 5, 7 and 10-year horizons; and (iv) a discussion of what the forecasts mean for UAV engineers, including the actuation role that distinguishes agriculture from purely observational domains.</w:t>
+        <w:t xml:space="preserve">This paper answers both questions with a reproducible bibliometric time series and a transparent forecasting pipeline, applying the methodology we developed for UAVs in ecology and environmental monitoring [20] to the agricultural domain. Our contributions are: (i) an openly queryable annual data set (2005–2025) of UAV research in agriculture, with a documented noise filter, four denominators and seven application sub-domains, built from the OpenAlex index [4]; (ii) a description of the current state of the field, including trend tests, a structural break and the distribution of output over sub-domains, countries and venues; (iii) a MATLAB algorithm, free of toolbox dependencies, that fits and compares four classical growth models, validates them out of sample and produces bootstrapped forecasts for 3, 5, 7 and 10-year horizons; (iv) the first like-for-like comparison of two application domains — agriculture and environmental monitoring — measured with the identical query protocol, index and pipeline on the same day; and (v) a discussion of what the forecasts mean for UAV engineers, including the actuation role that distinguishes agriculture from purely observational domains.</w:t>
       </w:r>
     </w:p>
     <w:p>
@@ -3686,6 +3686,809 @@
     </w:p>
     <w:p>
       <w:pPr>
+        <w:pStyle w:val="Heading2"/>
+        <w:rPr/>
+      </w:pPr>
+      <w:r>
+        <w:rPr/>
+        <w:t xml:space="preserve">Two Domains, One Instrument: Agriculture versus Environmental Monitoring</w:t>
+      </w:r>
+    </w:p>
+    <w:p>
+      <w:pPr>
+        <w:pStyle w:val="BodyText"/>
+        <w:rPr/>
+      </w:pPr>
+      <w:r>
+        <w:rPr/>
+        <w:t xml:space="preserve">Because the companion study of UAVs in ecology and environmental monitoring [20] used the identical index, query protocol, retrieval procedure and estimation pipeline, the two domains can be compared like for like: any difference in Table III is domain signal, not method. Three differences stand out. First, the two adoption curves have nearly the same estimated ceiling — 13.8 and 13.3 articles per 1,000 of the host literature — but agriculture reached 62 percent of it in 2025 against 85 percent in environmental monitoring, with the inflection dated four years later (2023–2024 versus 2019–2020); agriculture is the same S-curve shifted right. Second, the model weights tell the same story from the other side: for absolute output the exponential model leads in agriculture (0.39) while the saturating Gompertz and logistic models lead in environmental monitoring (0.70 combined), exactly what is expected of an earlier position on the curve. Third, the precision of the query moves in opposite directions over time: in agriculture the early literature is dominated by generic UAV engineering papers that mention farming only as a prospective application (precision 37 percent before 2016 against 61 percent overall), whereas in environmental monitoring early precision was, if anything, higher (68 against 60 percent). The two domains share the structural break — 2009 in agriculture, 2010 in environmental monitoring — marking the common technology shock of low-cost multirotor platforms.</w:t>
+      </w:r>
+    </w:p>
+    <w:p>
+      <w:pPr>
+        <w:pStyle w:val="tablehead"/>
+        <w:numPr>
+          <w:ilvl w:val="0"/>
+          <w:numId w:val="6"/>
+        </w:numPr>
+        <w:ind w:hanging="0" w:start="0"/>
+        <w:rPr/>
+      </w:pPr>
+      <w:r>
+        <w:rPr/>
+        <w:t xml:space="preserve">The Same Pipeline Applied to Two Domains (This Paper and [20])</w:t>
+      </w:r>
+    </w:p>
+    <w:tbl>
+      <w:tblPr>
+        <w:tblW w:w="4736" w:type="dxa"/>
+        <w:jc w:val="center"/>
+        <w:tblLayout w:type="fixed"/>
+        <w:tblCellMar>
+          <w:top w:w="0" w:type="dxa"/>
+          <w:start w:w="57" w:type="dxa"/>
+          <w:bottom w:w="0" w:type="dxa"/>
+          <w:end w:w="57" w:type="dxa"/>
+        </w:tblCellMar>
+      </w:tblPr>
+      <w:tblGrid>
+        <w:gridCol w:w="1836"/>
+        <w:gridCol w:w="1500"/>
+        <w:gridCol w:w="1400"/>
+      </w:tblGrid>
+      <w:tr>
+        <w:trPr>
+          <w:tblHeader w:val="true"/>
+          <w:cantSplit w:val="true"/>
+        </w:trPr>
+        <w:tc>
+          <w:tcPr>
+            <w:tcW w:w="1836" w:type="dxa"/>
+            <w:tcBorders>
+              <w:top w:val="single" w:sz="2" w:space="0" w:color="000000"/>
+              <w:start w:val="single" w:sz="2" w:space="0" w:color="000000"/>
+              <w:bottom w:val="single" w:sz="2" w:space="0" w:color="000000"/>
+              <w:end w:val="single" w:sz="2" w:space="0" w:color="000000"/>
+            </w:tcBorders>
+            <w:vAlign w:val="center"/>
+          </w:tcPr>
+          <w:p>
+            <w:pPr>
+              <w:pStyle w:val="tablecolhead"/>
+              <w:jc w:val="center"/>
+              <w:rPr/>
+            </w:pPr>
+            <w:r>
+              <w:rPr/>
+              <w:t xml:space="preserve">Indicator</w:t>
+            </w:r>
+          </w:p>
+        </w:tc>
+        <w:tc>
+          <w:tcPr>
+            <w:tcW w:w="1500" w:type="dxa"/>
+            <w:tcBorders>
+              <w:top w:val="single" w:sz="2" w:space="0" w:color="000000"/>
+              <w:start w:val="single" w:sz="2" w:space="0" w:color="000000"/>
+              <w:bottom w:val="single" w:sz="2" w:space="0" w:color="000000"/>
+              <w:end w:val="single" w:sz="2" w:space="0" w:color="000000"/>
+            </w:tcBorders>
+            <w:vAlign w:val="center"/>
+          </w:tcPr>
+          <w:p>
+            <w:pPr>
+              <w:pStyle w:val="tablecolhead"/>
+              <w:jc w:val="center"/>
+              <w:rPr/>
+            </w:pPr>
+            <w:r>
+              <w:rPr/>
+              <w:t xml:space="preserve">Agriculture</w:t>
+            </w:r>
+          </w:p>
+        </w:tc>
+        <w:tc>
+          <w:tcPr>
+            <w:tcW w:w="1400" w:type="dxa"/>
+            <w:tcBorders>
+              <w:top w:val="single" w:sz="2" w:space="0" w:color="000000"/>
+              <w:start w:val="single" w:sz="2" w:space="0" w:color="000000"/>
+              <w:bottom w:val="single" w:sz="2" w:space="0" w:color="000000"/>
+              <w:end w:val="single" w:sz="2" w:space="0" w:color="000000"/>
+            </w:tcBorders>
+            <w:vAlign w:val="center"/>
+          </w:tcPr>
+          <w:p>
+            <w:pPr>
+              <w:pStyle w:val="tablecolhead"/>
+              <w:jc w:val="center"/>
+              <w:rPr/>
+            </w:pPr>
+            <w:r>
+              <w:rPr/>
+              <w:t xml:space="preserve">Env. monitoring</w:t>
+            </w:r>
+          </w:p>
+        </w:tc>
+      </w:tr>
+      <w:tr>
+        <w:trPr>
+          <w:cantSplit w:val="true"/>
+        </w:trPr>
+        <w:tc>
+          <w:tcPr>
+            <w:tcW w:w="1836" w:type="dxa"/>
+            <w:tcBorders>
+              <w:top w:val="single" w:sz="2" w:space="0" w:color="000000"/>
+              <w:start w:val="single" w:sz="2" w:space="0" w:color="000000"/>
+              <w:bottom w:val="single" w:sz="2" w:space="0" w:color="000000"/>
+              <w:end w:val="single" w:sz="2" w:space="0" w:color="000000"/>
+            </w:tcBorders>
+            <w:vAlign w:val="center"/>
+          </w:tcPr>
+          <w:p>
+            <w:pPr>
+              <w:pStyle w:val="tablecopy"/>
+              <w:jc w:val="left"/>
+              <w:rPr/>
+            </w:pPr>
+            <w:r>
+              <w:rPr/>
+              <w:t xml:space="preserve">Articles in 2025</w:t>
+            </w:r>
+          </w:p>
+        </w:tc>
+        <w:tc>
+          <w:tcPr>
+            <w:tcW w:w="1500" w:type="dxa"/>
+            <w:tcBorders>
+              <w:top w:val="single" w:sz="2" w:space="0" w:color="000000"/>
+              <w:start w:val="single" w:sz="2" w:space="0" w:color="000000"/>
+              <w:bottom w:val="single" w:sz="2" w:space="0" w:color="000000"/>
+              <w:end w:val="single" w:sz="2" w:space="0" w:color="000000"/>
+            </w:tcBorders>
+            <w:vAlign w:val="center"/>
+          </w:tcPr>
+          <w:p>
+            <w:pPr>
+              <w:pStyle w:val="tablecopy"/>
+              <w:jc w:val="center"/>
+              <w:rPr/>
+            </w:pPr>
+            <w:r>
+              <w:rPr/>
+              <w:t xml:space="preserve">4,381</w:t>
+            </w:r>
+          </w:p>
+        </w:tc>
+        <w:tc>
+          <w:tcPr>
+            <w:tcW w:w="1400" w:type="dxa"/>
+            <w:tcBorders>
+              <w:top w:val="single" w:sz="2" w:space="0" w:color="000000"/>
+              <w:start w:val="single" w:sz="2" w:space="0" w:color="000000"/>
+              <w:bottom w:val="single" w:sz="2" w:space="0" w:color="000000"/>
+              <w:end w:val="single" w:sz="2" w:space="0" w:color="000000"/>
+            </w:tcBorders>
+            <w:vAlign w:val="center"/>
+          </w:tcPr>
+          <w:p>
+            <w:pPr>
+              <w:pStyle w:val="tablecopy"/>
+              <w:jc w:val="center"/>
+              <w:rPr/>
+            </w:pPr>
+            <w:r>
+              <w:rPr/>
+              <w:t xml:space="preserve">4,747</w:t>
+            </w:r>
+          </w:p>
+        </w:tc>
+      </w:tr>
+      <w:tr>
+        <w:trPr>
+          <w:cantSplit w:val="true"/>
+        </w:trPr>
+        <w:tc>
+          <w:tcPr>
+            <w:tcW w:w="1836" w:type="dxa"/>
+            <w:tcBorders>
+              <w:top w:val="single" w:sz="2" w:space="0" w:color="000000"/>
+              <w:start w:val="single" w:sz="2" w:space="0" w:color="000000"/>
+              <w:bottom w:val="single" w:sz="2" w:space="0" w:color="000000"/>
+              <w:end w:val="single" w:sz="2" w:space="0" w:color="000000"/>
+            </w:tcBorders>
+            <w:vAlign w:val="center"/>
+          </w:tcPr>
+          <w:p>
+            <w:pPr>
+              <w:pStyle w:val="tablecopy"/>
+              <w:jc w:val="left"/>
+              <w:rPr/>
+            </w:pPr>
+            <w:r>
+              <w:rPr/>
+              <w:t xml:space="preserve">CAGR 2005–2025</w:t>
+            </w:r>
+          </w:p>
+        </w:tc>
+        <w:tc>
+          <w:tcPr>
+            <w:tcW w:w="1500" w:type="dxa"/>
+            <w:tcBorders>
+              <w:top w:val="single" w:sz="2" w:space="0" w:color="000000"/>
+              <w:start w:val="single" w:sz="2" w:space="0" w:color="000000"/>
+              <w:bottom w:val="single" w:sz="2" w:space="0" w:color="000000"/>
+              <w:end w:val="single" w:sz="2" w:space="0" w:color="000000"/>
+            </w:tcBorders>
+            <w:vAlign w:val="center"/>
+          </w:tcPr>
+          <w:p>
+            <w:pPr>
+              <w:pStyle w:val="tablecopy"/>
+              <w:jc w:val="center"/>
+              <w:rPr/>
+            </w:pPr>
+            <w:r>
+              <w:rPr/>
+              <w:t xml:space="preserve">28.5 %</w:t>
+            </w:r>
+          </w:p>
+        </w:tc>
+        <w:tc>
+          <w:tcPr>
+            <w:tcW w:w="1400" w:type="dxa"/>
+            <w:tcBorders>
+              <w:top w:val="single" w:sz="2" w:space="0" w:color="000000"/>
+              <w:start w:val="single" w:sz="2" w:space="0" w:color="000000"/>
+              <w:bottom w:val="single" w:sz="2" w:space="0" w:color="000000"/>
+              <w:end w:val="single" w:sz="2" w:space="0" w:color="000000"/>
+            </w:tcBorders>
+            <w:vAlign w:val="center"/>
+          </w:tcPr>
+          <w:p>
+            <w:pPr>
+              <w:pStyle w:val="tablecopy"/>
+              <w:jc w:val="center"/>
+              <w:rPr/>
+            </w:pPr>
+            <w:r>
+              <w:rPr/>
+              <w:t xml:space="preserve">29.3 %</w:t>
+            </w:r>
+          </w:p>
+        </w:tc>
+      </w:tr>
+      <w:tr>
+        <w:trPr>
+          <w:cantSplit w:val="true"/>
+        </w:trPr>
+        <w:tc>
+          <w:tcPr>
+            <w:tcW w:w="1836" w:type="dxa"/>
+            <w:tcBorders>
+              <w:top w:val="single" w:sz="2" w:space="0" w:color="000000"/>
+              <w:start w:val="single" w:sz="2" w:space="0" w:color="000000"/>
+              <w:bottom w:val="single" w:sz="2" w:space="0" w:color="000000"/>
+              <w:end w:val="single" w:sz="2" w:space="0" w:color="000000"/>
+            </w:tcBorders>
+            <w:vAlign w:val="center"/>
+          </w:tcPr>
+          <w:p>
+            <w:pPr>
+              <w:pStyle w:val="tablecopy"/>
+              <w:jc w:val="left"/>
+              <w:rPr/>
+            </w:pPr>
+            <w:r>
+              <w:rPr/>
+              <w:t xml:space="preserve">Structural break</w:t>
+            </w:r>
+          </w:p>
+        </w:tc>
+        <w:tc>
+          <w:tcPr>
+            <w:tcW w:w="1500" w:type="dxa"/>
+            <w:tcBorders>
+              <w:top w:val="single" w:sz="2" w:space="0" w:color="000000"/>
+              <w:start w:val="single" w:sz="2" w:space="0" w:color="000000"/>
+              <w:bottom w:val="single" w:sz="2" w:space="0" w:color="000000"/>
+              <w:end w:val="single" w:sz="2" w:space="0" w:color="000000"/>
+            </w:tcBorders>
+            <w:vAlign w:val="center"/>
+          </w:tcPr>
+          <w:p>
+            <w:pPr>
+              <w:pStyle w:val="tablecopy"/>
+              <w:jc w:val="center"/>
+              <w:rPr/>
+            </w:pPr>
+            <w:r>
+              <w:rPr/>
+              <w:t xml:space="preserve">2009 (16→32 %/yr)</w:t>
+            </w:r>
+          </w:p>
+        </w:tc>
+        <w:tc>
+          <w:tcPr>
+            <w:tcW w:w="1400" w:type="dxa"/>
+            <w:tcBorders>
+              <w:top w:val="single" w:sz="2" w:space="0" w:color="000000"/>
+              <w:start w:val="single" w:sz="2" w:space="0" w:color="000000"/>
+              <w:bottom w:val="single" w:sz="2" w:space="0" w:color="000000"/>
+              <w:end w:val="single" w:sz="2" w:space="0" w:color="000000"/>
+            </w:tcBorders>
+            <w:vAlign w:val="center"/>
+          </w:tcPr>
+          <w:p>
+            <w:pPr>
+              <w:pStyle w:val="tablecopy"/>
+              <w:jc w:val="center"/>
+              <w:rPr/>
+            </w:pPr>
+            <w:r>
+              <w:rPr/>
+              <w:t xml:space="preserve">2010 (17→34 %/yr)</w:t>
+            </w:r>
+          </w:p>
+        </w:tc>
+      </w:tr>
+      <w:tr>
+        <w:trPr>
+          <w:cantSplit w:val="true"/>
+        </w:trPr>
+        <w:tc>
+          <w:tcPr>
+            <w:tcW w:w="1836" w:type="dxa"/>
+            <w:tcBorders>
+              <w:top w:val="single" w:sz="2" w:space="0" w:color="000000"/>
+              <w:start w:val="single" w:sz="2" w:space="0" w:color="000000"/>
+              <w:bottom w:val="single" w:sz="2" w:space="0" w:color="000000"/>
+              <w:end w:val="single" w:sz="2" w:space="0" w:color="000000"/>
+            </w:tcBorders>
+            <w:vAlign w:val="center"/>
+          </w:tcPr>
+          <w:p>
+            <w:pPr>
+              <w:pStyle w:val="tablecopy"/>
+              <w:jc w:val="left"/>
+              <w:rPr/>
+            </w:pPr>
+            <w:r>
+              <w:rPr/>
+              <w:t xml:space="preserve">Share in 2025 (per 1,000)</w:t>
+            </w:r>
+          </w:p>
+        </w:tc>
+        <w:tc>
+          <w:tcPr>
+            <w:tcW w:w="1500" w:type="dxa"/>
+            <w:tcBorders>
+              <w:top w:val="single" w:sz="2" w:space="0" w:color="000000"/>
+              <w:start w:val="single" w:sz="2" w:space="0" w:color="000000"/>
+              <w:bottom w:val="single" w:sz="2" w:space="0" w:color="000000"/>
+              <w:end w:val="single" w:sz="2" w:space="0" w:color="000000"/>
+            </w:tcBorders>
+            <w:vAlign w:val="center"/>
+          </w:tcPr>
+          <w:p>
+            <w:pPr>
+              <w:pStyle w:val="tablecopy"/>
+              <w:jc w:val="center"/>
+              <w:rPr/>
+            </w:pPr>
+            <w:r>
+              <w:rPr/>
+              <w:t xml:space="preserve">8.5</w:t>
+            </w:r>
+          </w:p>
+        </w:tc>
+        <w:tc>
+          <w:tcPr>
+            <w:tcW w:w="1400" w:type="dxa"/>
+            <w:tcBorders>
+              <w:top w:val="single" w:sz="2" w:space="0" w:color="000000"/>
+              <w:start w:val="single" w:sz="2" w:space="0" w:color="000000"/>
+              <w:bottom w:val="single" w:sz="2" w:space="0" w:color="000000"/>
+              <w:end w:val="single" w:sz="2" w:space="0" w:color="000000"/>
+            </w:tcBorders>
+            <w:vAlign w:val="center"/>
+          </w:tcPr>
+          <w:p>
+            <w:pPr>
+              <w:pStyle w:val="tablecopy"/>
+              <w:jc w:val="center"/>
+              <w:rPr/>
+            </w:pPr>
+            <w:r>
+              <w:rPr/>
+              <w:t xml:space="preserve">11.3</w:t>
+            </w:r>
+          </w:p>
+        </w:tc>
+      </w:tr>
+      <w:tr>
+        <w:trPr>
+          <w:cantSplit w:val="true"/>
+        </w:trPr>
+        <w:tc>
+          <w:tcPr>
+            <w:tcW w:w="1836" w:type="dxa"/>
+            <w:tcBorders>
+              <w:top w:val="single" w:sz="2" w:space="0" w:color="000000"/>
+              <w:start w:val="single" w:sz="2" w:space="0" w:color="000000"/>
+              <w:bottom w:val="single" w:sz="2" w:space="0" w:color="000000"/>
+              <w:end w:val="single" w:sz="2" w:space="0" w:color="000000"/>
+            </w:tcBorders>
+            <w:vAlign w:val="center"/>
+          </w:tcPr>
+          <w:p>
+            <w:pPr>
+              <w:pStyle w:val="tablecopy"/>
+              <w:jc w:val="left"/>
+              <w:rPr/>
+            </w:pPr>
+            <w:r>
+              <w:rPr/>
+              <w:t xml:space="preserve">Logistic plateau (per 1,000)</w:t>
+            </w:r>
+          </w:p>
+        </w:tc>
+        <w:tc>
+          <w:tcPr>
+            <w:tcW w:w="1500" w:type="dxa"/>
+            <w:tcBorders>
+              <w:top w:val="single" w:sz="2" w:space="0" w:color="000000"/>
+              <w:start w:val="single" w:sz="2" w:space="0" w:color="000000"/>
+              <w:bottom w:val="single" w:sz="2" w:space="0" w:color="000000"/>
+              <w:end w:val="single" w:sz="2" w:space="0" w:color="000000"/>
+            </w:tcBorders>
+            <w:vAlign w:val="center"/>
+          </w:tcPr>
+          <w:p>
+            <w:pPr>
+              <w:pStyle w:val="tablecopy"/>
+              <w:jc w:val="center"/>
+              <w:rPr/>
+            </w:pPr>
+            <w:r>
+              <w:rPr/>
+              <w:t xml:space="preserve">13.8</w:t>
+            </w:r>
+          </w:p>
+        </w:tc>
+        <w:tc>
+          <w:tcPr>
+            <w:tcW w:w="1400" w:type="dxa"/>
+            <w:tcBorders>
+              <w:top w:val="single" w:sz="2" w:space="0" w:color="000000"/>
+              <w:start w:val="single" w:sz="2" w:space="0" w:color="000000"/>
+              <w:bottom w:val="single" w:sz="2" w:space="0" w:color="000000"/>
+              <w:end w:val="single" w:sz="2" w:space="0" w:color="000000"/>
+            </w:tcBorders>
+            <w:vAlign w:val="center"/>
+          </w:tcPr>
+          <w:p>
+            <w:pPr>
+              <w:pStyle w:val="tablecopy"/>
+              <w:jc w:val="center"/>
+              <w:rPr/>
+            </w:pPr>
+            <w:r>
+              <w:rPr/>
+              <w:t xml:space="preserve">13.3</w:t>
+            </w:r>
+          </w:p>
+        </w:tc>
+      </w:tr>
+      <w:tr>
+        <w:trPr>
+          <w:cantSplit w:val="true"/>
+        </w:trPr>
+        <w:tc>
+          <w:tcPr>
+            <w:tcW w:w="1836" w:type="dxa"/>
+            <w:tcBorders>
+              <w:top w:val="single" w:sz="2" w:space="0" w:color="000000"/>
+              <w:start w:val="single" w:sz="2" w:space="0" w:color="000000"/>
+              <w:bottom w:val="single" w:sz="2" w:space="0" w:color="000000"/>
+              <w:end w:val="single" w:sz="2" w:space="0" w:color="000000"/>
+            </w:tcBorders>
+            <w:vAlign w:val="center"/>
+          </w:tcPr>
+          <w:p>
+            <w:pPr>
+              <w:pStyle w:val="tablecopy"/>
+              <w:jc w:val="left"/>
+              <w:rPr/>
+            </w:pPr>
+            <w:r>
+              <w:rPr/>
+              <w:t xml:space="preserve">Plateau reached in 2025</w:t>
+            </w:r>
+          </w:p>
+        </w:tc>
+        <w:tc>
+          <w:tcPr>
+            <w:tcW w:w="1500" w:type="dxa"/>
+            <w:tcBorders>
+              <w:top w:val="single" w:sz="2" w:space="0" w:color="000000"/>
+              <w:start w:val="single" w:sz="2" w:space="0" w:color="000000"/>
+              <w:bottom w:val="single" w:sz="2" w:space="0" w:color="000000"/>
+              <w:end w:val="single" w:sz="2" w:space="0" w:color="000000"/>
+            </w:tcBorders>
+            <w:vAlign w:val="center"/>
+          </w:tcPr>
+          <w:p>
+            <w:pPr>
+              <w:pStyle w:val="tablecopy"/>
+              <w:jc w:val="center"/>
+              <w:rPr/>
+            </w:pPr>
+            <w:r>
+              <w:rPr/>
+              <w:t xml:space="preserve">62 %</w:t>
+            </w:r>
+          </w:p>
+        </w:tc>
+        <w:tc>
+          <w:tcPr>
+            <w:tcW w:w="1400" w:type="dxa"/>
+            <w:tcBorders>
+              <w:top w:val="single" w:sz="2" w:space="0" w:color="000000"/>
+              <w:start w:val="single" w:sz="2" w:space="0" w:color="000000"/>
+              <w:bottom w:val="single" w:sz="2" w:space="0" w:color="000000"/>
+              <w:end w:val="single" w:sz="2" w:space="0" w:color="000000"/>
+            </w:tcBorders>
+            <w:vAlign w:val="center"/>
+          </w:tcPr>
+          <w:p>
+            <w:pPr>
+              <w:pStyle w:val="tablecopy"/>
+              <w:jc w:val="center"/>
+              <w:rPr/>
+            </w:pPr>
+            <w:r>
+              <w:rPr/>
+              <w:t xml:space="preserve">85 %</w:t>
+            </w:r>
+          </w:p>
+        </w:tc>
+      </w:tr>
+      <w:tr>
+        <w:trPr>
+          <w:cantSplit w:val="true"/>
+        </w:trPr>
+        <w:tc>
+          <w:tcPr>
+            <w:tcW w:w="1836" w:type="dxa"/>
+            <w:tcBorders>
+              <w:top w:val="single" w:sz="2" w:space="0" w:color="000000"/>
+              <w:start w:val="single" w:sz="2" w:space="0" w:color="000000"/>
+              <w:bottom w:val="single" w:sz="2" w:space="0" w:color="000000"/>
+              <w:end w:val="single" w:sz="2" w:space="0" w:color="000000"/>
+            </w:tcBorders>
+            <w:vAlign w:val="center"/>
+          </w:tcPr>
+          <w:p>
+            <w:pPr>
+              <w:pStyle w:val="tablecopy"/>
+              <w:jc w:val="left"/>
+              <w:rPr/>
+            </w:pPr>
+            <w:r>
+              <w:rPr/>
+              <w:t xml:space="preserve">Share inflection</w:t>
+            </w:r>
+          </w:p>
+        </w:tc>
+        <w:tc>
+          <w:tcPr>
+            <w:tcW w:w="1500" w:type="dxa"/>
+            <w:tcBorders>
+              <w:top w:val="single" w:sz="2" w:space="0" w:color="000000"/>
+              <w:start w:val="single" w:sz="2" w:space="0" w:color="000000"/>
+              <w:bottom w:val="single" w:sz="2" w:space="0" w:color="000000"/>
+              <w:end w:val="single" w:sz="2" w:space="0" w:color="000000"/>
+            </w:tcBorders>
+            <w:vAlign w:val="center"/>
+          </w:tcPr>
+          <w:p>
+            <w:pPr>
+              <w:pStyle w:val="tablecopy"/>
+              <w:jc w:val="center"/>
+              <w:rPr/>
+            </w:pPr>
+            <w:r>
+              <w:rPr/>
+              <w:t xml:space="preserve">2023–2024</w:t>
+            </w:r>
+          </w:p>
+        </w:tc>
+        <w:tc>
+          <w:tcPr>
+            <w:tcW w:w="1400" w:type="dxa"/>
+            <w:tcBorders>
+              <w:top w:val="single" w:sz="2" w:space="0" w:color="000000"/>
+              <w:start w:val="single" w:sz="2" w:space="0" w:color="000000"/>
+              <w:bottom w:val="single" w:sz="2" w:space="0" w:color="000000"/>
+              <w:end w:val="single" w:sz="2" w:space="0" w:color="000000"/>
+            </w:tcBorders>
+            <w:vAlign w:val="center"/>
+          </w:tcPr>
+          <w:p>
+            <w:pPr>
+              <w:pStyle w:val="tablecopy"/>
+              <w:jc w:val="center"/>
+              <w:rPr/>
+            </w:pPr>
+            <w:r>
+              <w:rPr/>
+              <w:t xml:space="preserve">2019–2020</w:t>
+            </w:r>
+          </w:p>
+        </w:tc>
+      </w:tr>
+      <w:tr>
+        <w:trPr>
+          <w:cantSplit w:val="true"/>
+        </w:trPr>
+        <w:tc>
+          <w:tcPr>
+            <w:tcW w:w="1836" w:type="dxa"/>
+            <w:tcBorders>
+              <w:top w:val="single" w:sz="2" w:space="0" w:color="000000"/>
+              <w:start w:val="single" w:sz="2" w:space="0" w:color="000000"/>
+              <w:bottom w:val="single" w:sz="2" w:space="0" w:color="000000"/>
+              <w:end w:val="single" w:sz="2" w:space="0" w:color="000000"/>
+            </w:tcBorders>
+            <w:vAlign w:val="center"/>
+          </w:tcPr>
+          <w:p>
+            <w:pPr>
+              <w:pStyle w:val="tablecopy"/>
+              <w:jc w:val="left"/>
+              <w:rPr/>
+            </w:pPr>
+            <w:r>
+              <w:rPr/>
+              <w:t xml:space="preserve">Top count model (weight)</w:t>
+            </w:r>
+          </w:p>
+        </w:tc>
+        <w:tc>
+          <w:tcPr>
+            <w:tcW w:w="1500" w:type="dxa"/>
+            <w:tcBorders>
+              <w:top w:val="single" w:sz="2" w:space="0" w:color="000000"/>
+              <w:start w:val="single" w:sz="2" w:space="0" w:color="000000"/>
+              <w:bottom w:val="single" w:sz="2" w:space="0" w:color="000000"/>
+              <w:end w:val="single" w:sz="2" w:space="0" w:color="000000"/>
+            </w:tcBorders>
+            <w:vAlign w:val="center"/>
+          </w:tcPr>
+          <w:p>
+            <w:pPr>
+              <w:pStyle w:val="tablecopy"/>
+              <w:jc w:val="center"/>
+              <w:rPr/>
+            </w:pPr>
+            <w:r>
+              <w:rPr/>
+              <w:t xml:space="preserve">exponential (0.39)</w:t>
+            </w:r>
+          </w:p>
+        </w:tc>
+        <w:tc>
+          <w:tcPr>
+            <w:tcW w:w="1400" w:type="dxa"/>
+            <w:tcBorders>
+              <w:top w:val="single" w:sz="2" w:space="0" w:color="000000"/>
+              <w:start w:val="single" w:sz="2" w:space="0" w:color="000000"/>
+              <w:bottom w:val="single" w:sz="2" w:space="0" w:color="000000"/>
+              <w:end w:val="single" w:sz="2" w:space="0" w:color="000000"/>
+            </w:tcBorders>
+            <w:vAlign w:val="center"/>
+          </w:tcPr>
+          <w:p>
+            <w:pPr>
+              <w:pStyle w:val="tablecopy"/>
+              <w:jc w:val="center"/>
+              <w:rPr/>
+            </w:pPr>
+            <w:r>
+              <w:rPr/>
+              <w:t xml:space="preserve">Gompertz (0.41)</w:t>
+            </w:r>
+          </w:p>
+        </w:tc>
+      </w:tr>
+      <w:tr>
+        <w:trPr>
+          <w:cantSplit w:val="true"/>
+        </w:trPr>
+        <w:tc>
+          <w:tcPr>
+            <w:tcW w:w="1836" w:type="dxa"/>
+            <w:tcBorders>
+              <w:top w:val="single" w:sz="2" w:space="0" w:color="000000"/>
+              <w:start w:val="single" w:sz="2" w:space="0" w:color="000000"/>
+              <w:bottom w:val="single" w:sz="2" w:space="0" w:color="000000"/>
+              <w:end w:val="single" w:sz="2" w:space="0" w:color="000000"/>
+            </w:tcBorders>
+            <w:vAlign w:val="center"/>
+          </w:tcPr>
+          <w:p>
+            <w:pPr>
+              <w:pStyle w:val="tablecopy"/>
+              <w:jc w:val="left"/>
+              <w:rPr/>
+            </w:pPr>
+            <w:r>
+              <w:rPr/>
+              <w:t xml:space="preserve">Precision, overall / early</w:t>
+            </w:r>
+          </w:p>
+        </w:tc>
+        <w:tc>
+          <w:tcPr>
+            <w:tcW w:w="1500" w:type="dxa"/>
+            <w:tcBorders>
+              <w:top w:val="single" w:sz="2" w:space="0" w:color="000000"/>
+              <w:start w:val="single" w:sz="2" w:space="0" w:color="000000"/>
+              <w:bottom w:val="single" w:sz="2" w:space="0" w:color="000000"/>
+              <w:end w:val="single" w:sz="2" w:space="0" w:color="000000"/>
+            </w:tcBorders>
+            <w:vAlign w:val="center"/>
+          </w:tcPr>
+          <w:p>
+            <w:pPr>
+              <w:pStyle w:val="tablecopy"/>
+              <w:jc w:val="center"/>
+              <w:rPr/>
+            </w:pPr>
+            <w:r>
+              <w:rPr/>
+              <w:t xml:space="preserve">61 % / 37 %</w:t>
+            </w:r>
+          </w:p>
+        </w:tc>
+        <w:tc>
+          <w:tcPr>
+            <w:tcW w:w="1400" w:type="dxa"/>
+            <w:tcBorders>
+              <w:top w:val="single" w:sz="2" w:space="0" w:color="000000"/>
+              <w:start w:val="single" w:sz="2" w:space="0" w:color="000000"/>
+              <w:bottom w:val="single" w:sz="2" w:space="0" w:color="000000"/>
+              <w:end w:val="single" w:sz="2" w:space="0" w:color="000000"/>
+            </w:tcBorders>
+            <w:vAlign w:val="center"/>
+          </w:tcPr>
+          <w:p>
+            <w:pPr>
+              <w:pStyle w:val="tablecopy"/>
+              <w:jc w:val="center"/>
+              <w:rPr/>
+            </w:pPr>
+            <w:r>
+              <w:rPr/>
+              <w:t xml:space="preserve">60 % / 68 %</w:t>
+            </w:r>
+          </w:p>
+        </w:tc>
+      </w:tr>
+    </w:tbl>
+    <w:p>
+      <w:pPr>
+        <w:pStyle w:val="Normal"/>
+        <w:spacing w:before="0" w:after="120"/>
+        <w:rPr>
+          <w:sz w:val="8"/>
+        </w:rPr>
+      </w:pPr>
+    </w:p>
+    <w:p>
+      <w:pPr>
         <w:pStyle w:val="Heading1"/>
         <w:rPr/>
       </w:pPr>
@@ -3701,7 +4504,7 @@
       </w:pPr>
       <w:r>
         <w:rPr/>
-        <w:t xml:space="preserve">What the Forecasts Mean</w:t>
+        <w:t xml:space="preserve">Reading the Forecasts: an Earlier Point on the Curve</w:t>
       </w:r>
     </w:p>
     <w:p>
@@ -3721,7 +4524,7 @@
       </w:pPr>
       <w:r>
         <w:rPr/>
-        <w:t xml:space="preserve">Implications for the Robotics Community</w:t>
+        <w:t xml:space="preserve">From Sensing to Actuation: Implications for Robotics</w:t>
       </w:r>
     </w:p>
     <w:p>
@@ -3741,6 +4544,26 @@
       </w:pPr>
       <w:r>
         <w:rPr/>
+        <w:t xml:space="preserve">The Croatian Perspective</w:t>
+      </w:r>
+    </w:p>
+    <w:p>
+      <w:pPr>
+        <w:pStyle w:val="BodyText"/>
+        <w:rPr/>
+      </w:pPr>
+      <w:r>
+        <w:rPr/>
+        <w:t xml:space="preserve">Croatia illustrates where a small EU country sits on this curve. All 34 Croatian articles date from 2013 onwards, 26 of them from 2020 onwards and 10 from 2025 alone — an output that mirrors the global curve with a delay of several years and is now accelerating. Croatian groups still publish almost twice as much on environmental as on agricultural UAV applications (62 against 34 articles over the same period, 18 against 10 in 2025) [20], the reverse of the global proportion. With the spraying path closed by Directive 2009/128/EC [18] and a farm structure dominated by small family holdings, the realistic national niche is the sensing side of Table III: disease, irrigation and yield monitoring services for permanent crops such as vineyards and olive groves, where per-hectare data value is highest and UAV service models close economically on small parcels [9]. For the regional robotics community this is a concrete, regulation-proof entry point into the fastest-growing sub-domains.</w:t>
+      </w:r>
+    </w:p>
+    <w:p>
+      <w:pPr>
+        <w:pStyle w:val="Heading2"/>
+        <w:rPr/>
+      </w:pPr>
+      <w:r>
+        <w:rPr/>
         <w:t xml:space="preserve">Limitations</w:t>
       </w:r>
     </w:p>
@@ -3751,7 +4574,7 @@
       </w:pPr>
       <w:r>
         <w:rPr/>
-        <w:t xml:space="preserve">Four limitations bound the conclusions. First, the corpus depends on one index and one query whose strict precision is 61 percent, and, unlike in our companion study of environmental UAVs, precision was significantly lower in the early period, so the earliest counts overstate agricultural activity; the noise filter removes the identifiable homonyms but not generic UAV engineering papers. Second, the 2025 observation is partly an indexing artefact and carries disproportionate weight in the saturating models. Third, the sub-domain queries overlap and describe relative growth, not a partition of the total. Fourth, model uncertainty is represented by four parametric shapes only; a regulatory change — for example a European opening towards spraying derogations — would not be captured by any of them. The adoption figures from industry and extension sources [17] are heterogeneous and are used for context only.</w:t>
+        <w:t xml:space="preserve">Four limitations bound the conclusions. First, the corpus depends on one index and one query whose strict precision is 61 percent, and, unlike in our companion study of environmental UAVs [20], precision was significantly lower in the early period, so the earliest counts overstate agricultural activity; the noise filter removes the identifiable homonyms but not generic UAV engineering papers. Second, the 2025 observation is partly an indexing artefact and carries disproportionate weight in the saturating models. Third, the sub-domain queries overlap and describe relative growth, not a partition of the total. Fourth, model uncertainty is represented by four parametric shapes only; a regulatory change — for example a European opening towards spraying derogations — would not be captured by any of them. The adoption figures from industry and extension sources [17] are heterogeneous and are used for context only.</w:t>
       </w:r>
     </w:p>
     <w:p>
@@ -3771,7 +4594,7 @@
       </w:pPr>
       <w:r>
         <w:rPr/>
-        <w:t xml:space="preserve">A reproducible bibliometric series shows that research on UAVs in agriculture grew by 28.5 percent per year between 2005 and 2025, with a structural acceleration in 2009, and that its share of the agricultural literature is heading towards a plateau of about 14 articles per 1,000 of which less than two thirds has been reached — the field is earlier on the adoption curve than neighbouring environmental applications. Four growth models agree on a three-year forecast of roughly 8,200 articles in 2028 but diverge widely by 2035. Growth is migrating from mapping towards data-driven agronomy and towards actuation, where payloads, precision application and regulation, rather than sensors, are the open problems. The data, the query definitions and the code are provided with this paper so that the analysis can be repeated at any future retrieval date.</w:t>
+        <w:t xml:space="preserve">A reproducible bibliometric series shows that research on UAVs in agriculture grew by 28.5 percent per year between 2005 and 2025, with a structural acceleration in 2009, and that its share of the agricultural literature is heading towards a plateau of about 14 articles per 1,000 of which less than two thirds has been reached — the field sits on the same adoption curve as neighbouring environmental applications, measured with the identical instrument, but shifted about four years later [20]. Four growth models agree on a three-year forecast of roughly 8,200 articles in 2028 but diverge widely by 2035. Growth is migrating from mapping towards data-driven agronomy and towards actuation, where payloads, precision application and regulation, rather than sensors, are the open problems. The data, the query definitions and the code are provided with this paper so that the analysis can be repeated at any future retrieval date.</w:t>
       </w:r>
     </w:p>
     <w:p>
@@ -4296,6 +5119,21 @@
       <w:r>
         <w:rPr/>
         <w:t xml:space="preserve">, L 152, pp. 45–71, 2019.</w:t>
+      </w:r>
+    </w:p>
+    <w:p>
+      <w:pPr>
+        <w:pStyle w:val="references"/>
+        <w:numPr>
+          <w:ilvl w:val="0"/>
+          <w:numId w:val="4"/>
+        </w:numPr>
+        <w:ind w:hanging="0" w:start="0"/>
+        <w:rPr/>
+      </w:pPr>
+      <w:r>
+        <w:rPr/>
+        <w:t xml:space="preserve">V. Uroš and M. Jelić, "drone-ecology-forecast: bibliometric data and MATLAB growth-model pipeline for UAV research in ecology and environmental monitoring (v1.0)," Zenodo, 2026, doi: 10.5281/zenodo.22119199.</w:t>
       </w:r>
     </w:p>
     <w:p>

</xml_diff>

<commit_message>
Pre-emptive revision (mirrors ecology reviewer): MATLAB R2023b base rerun; saturating-model average (24,023 in 2035) in Table II and Abstract; model-average definition; share sensitivity without 2025 (K 13.8 -> 11.6, w 0.95); share under subfield/field11/all-works denominators; per-origin backtest MAPE; query-matched-records wording; Sandra Mandinic added as third author (Univ. of Zagreb, Faculty of Agriculture)
Co-Authored-By: Claude Fable 5 <noreply@anthropic.com>
Claude-Session: https://claude.ai/code/session_01DHGVPkToAeprTfin5ugPdx
</commit_message>
<xml_diff>
--- a/paper/MIPRO_Drones_Agriculture_Forecast.docx
+++ b/paper/MIPRO_Drones_Agriculture_Forecast.docx
@@ -33,6 +33,16 @@
         </w:rPr>
         <w:t xml:space="preserve">†</w:t>
       </w:r>
+      <w:r>
+        <w:rPr/>
+        <w:t xml:space="preserve">, Sandra Mandinić</w:t>
+      </w:r>
+      <w:r>
+        <w:rPr>
+          <w:vertAlign w:val="superscript"/>
+        </w:rPr>
+        <w:t xml:space="preserve">‡</w:t>
+      </w:r>
     </w:p>
     <w:p>
       <w:pPr>
@@ -58,6 +68,22 @@
       <w:r>
         <w:rPr/>
         <w:t xml:space="preserve"> Faculty of Organization and Informatics, University of Zagreb, Varaždin, Croatia</w:t>
+      </w:r>
+    </w:p>
+    <w:p>
+      <w:pPr>
+        <w:pStyle w:val="Affiliation"/>
+        <w:rPr/>
+      </w:pPr>
+      <w:r>
+        <w:rPr>
+          <w:vertAlign w:val="superscript"/>
+        </w:rPr>
+        <w:t xml:space="preserve">‡</w:t>
+      </w:r>
+      <w:r>
+        <w:rPr/>
+        <w:t xml:space="preserve"> University of Zagreb, Faculty of Agriculture, Zagreb, Croatia</w:t>
       </w:r>
     </w:p>
     <w:p>
@@ -105,7 +131,7 @@
       </w:r>
       <w:r>
         <w:rPr/>
-        <w:t xml:space="preserve">—Unmanned aerial vehicles (UAVs) are promoted as a cornerstone of precision agriculture, both as sensing platforms and, increasingly, as actuators for spraying, yet the pace and the likely saturation of this adoption have not been quantified. We compiled annual counts of peer-reviewed articles combining UAV terms with agricultural terms from the open bibliographic index OpenAlex for 2005 to 2025 (18,506 articles after noise filtering), together with four normalising denominators and seven application sub-domains, and fitted four growth models (exponential, logistic, Gompertz and Bass diffusion) by Poisson deviance in a toolbox-free MATLAB pipeline. Models were compared with a quasi-likelihood information criterion, validated by rolling-origin backtesting and bootstrapped for forecast intervals. Output grew at 28.5 percent per year (29 articles in 2005, 4,381 in 2025), with a structural break in 2009. No model dominates for absolute output: the model average predicts 8,174 articles in 2028 and 40,260 in 2035, with a ten-year interval of 13,390 to 55,050. The share of the agricultural literature that uses UAVs is saturating later than in neighbouring fields: a logistic model with weight 0.91 gives a plateau of 13.8 articles per 1,000, of which 62 percent was reached in 2025. A like-for-like comparison with our companion study of UAVs in environmental monitoring, produced with the identical pipeline, places agriculture about four years earlier on the same adoption curve. Growth is fastest in yield prediction, irrigation and disease detection, while spraying makes the UAV an actuator with distinct regulatory constraints. Implications for UAV design and autonomy are discussed.</w:t>
+        <w:t xml:space="preserve">—Unmanned aerial vehicles (UAVs) are promoted as a cornerstone of precision agriculture, both as sensing platforms and, increasingly, as actuators for spraying, yet the pace and the likely saturation of this adoption have not been quantified. We compiled annual counts of peer-reviewed articles combining UAV terms with agricultural terms from the open bibliographic index OpenAlex for 2005 to 2025 (18,506 articles after noise filtering), together with four normalising denominators and seven application sub-domains, and fitted four growth models (exponential, logistic, Gompertz and Bass diffusion) by Poisson deviance in a toolbox-free MATLAB pipeline. Models were compared with a quasi-likelihood information criterion, validated by rolling-origin backtesting and bootstrapped for forecast intervals. Output grew at 28.5 percent per year (29 articles in 2005, 4,381 in 2025), with a structural break in 2009. No model dominates for absolute output: the model average predicts 8,237 articles in 2028 [90 percent interval 6,422–9,457]; over ten years the models diverge, and the long-horizon forecast consistent with the share analysis is the average of the three saturating models, 24,023 articles in 2035 [6,570–52,895]. The share of the agricultural literature that uses UAVs is saturating later than in neighbouring fields: a logistic model with weight 0.91 gives a plateau of 13.8 articles per 1,000 (11.6 without the partly artefactual 2025 observation), of which about three fifths has been reached. A like-for-like comparison with our companion study of UAVs in environmental monitoring, produced with the identical pipeline, places agriculture about four years earlier on the same adoption curve. Growth is fastest in yield prediction, irrigation and disease detection, while spraying makes the UAV an actuator with distinct regulatory constraints. Implications for UAV design and autonomy are discussed.</w:t>
       </w:r>
     </w:p>
     <w:p>
@@ -215,7 +241,7 @@
       </w:pPr>
       <w:r>
         <w:rPr/>
-        <w:t xml:space="preserve">Data were retrieved on 28 August 2026 from the OpenAlex REST API [4], aggregated by publication year (endpoint /works, group_by=publication_year) with document type restricted to articles and reviews. The core query D AND A NOT N searched titles and abstracts, where D = (drone OR drones OR UAV OR UAVs OR UAS OR "unmanned aerial" OR "unmanned aircraft" OR RPAS OR "remotely piloted aircraft"), A is a disjunction of 38 agricultural terms (agriculture, farm, crop, yield, irrigation, fertilizer, pesticide, spraying, weed, phenotyping, livestock, orchard, vineyard, "plant disease", "soil moisture" and their variants), and N is a noise filter added after a manual precision check: it removes the Drosophila GAL4/UAS genetics literature, apian "drones", and medical and institutional homonyms of the UAV acronyms. Four denominators were retrieved with identical filters: A alone (the agricultural literature searched in the same way, used as the primary denominator), the OpenAlex subfield Agronomy and Crop Science, the field Agricultural and Biological Sciences, and all indexed works. Seven overlapping sub-domain queries combined D with terms for crop monitoring and phenotyping, spraying, weed detection, irrigation and water stress, disease and pest detection, yield prediction, and livestock. Because OpenAlex is updated retroactively, the retrieval date is part of the data definition; the exact Boolean strings and a codebook accompany the MATLAB code.</w:t>
+        <w:t xml:space="preserve">Data were retrieved on 28 August 2026 from the OpenAlex REST API [4], aggregated by publication year (endpoint /works, group_by=publication_year) with document type restricted to articles and reviews. The core query D AND A NOT N searched titles and abstracts, where D = (drone OR drones OR UAV OR UAVs OR UAS OR "unmanned aerial" OR "unmanned aircraft" OR RPAS OR "remotely piloted aircraft"), A is a disjunction of 38 agricultural terms (agriculture, farm, crop, yield, irrigation, fertilizer, pesticide, spraying, weed, phenotyping, livestock, orchard, vineyard, "plant disease", "soil moisture" and their variants), and N is a noise filter added after a manual precision check: it removes the Drosophila GAL4/UAS genetics literature, apian "drones", and medical and institutional homonyms of the UAV acronyms. Four denominators were retrieved with identical filters: A alone (the agricultural literature searched in the same way, used as the primary denominator), the OpenAlex subfield Agronomy and Crop Science, the field Agricultural and Biological Sciences, and all indexed works; all four are used in the share analysis (Section IV.C). Seven overlapping sub-domain queries combined D with terms for crop monitoring and phenotyping, spraying, weed detection, irrigation and water stress, disease and pest detection, yield prediction, and livestock. Because OpenAlex is updated retroactively, the retrieval date is part of the data definition; the exact Boolean strings and a codebook accompany the MATLAB code.</w:t>
       </w:r>
     </w:p>
     <w:p>
@@ -225,7 +251,7 @@
       </w:pPr>
       <w:r>
         <w:rPr/>
-        <w:t xml:space="preserve">The fitting window is 2005–2025 (n = 21 complete years); 2026 is incomplete and is excluded. The query is not perfectly precise. In a manual check of a random sample of 100 records of the unfiltered query (seed 20260828), coded with AI assistance and reviewed by the authors, 61 percent of the records surviving the noise filter [Wilson 95 percent CI 51, 70] were UAV studies with an agricultural application, a further 31 percent contained a UAV in a non-agricultural role, and 8 percent were residual noise. In an early-period sample (2005–2015, n = 35 after filtering) the relevant share was 37 percent [23, 54]; the difference is significant (two-proportion z = 2.38, p = 0.017), because the early literature is dominated by generic UAV engineering papers that mention agriculture only as a prospective application. Absolute counts therefore overstate strictly agricultural output by roughly 1.6 times, and the growth of that output is, if anything, faster than the growth of the query series. A stricter query that also excludes ecological and forestry terms grows at 28.5 percent per year as well, so the trend conclusions are robust. Finally, all series jump in 2025 (the agricultural denominator by 26 percent), which is partly an indexing artefact; normalisation attenuates it and a sensitivity analysis without 2025 is reported.</w:t>
+        <w:t xml:space="preserve">The fitting window is 2005–2025 (n = 21 complete years); 2026 is incomplete and is excluded. The query is not perfectly precise. In a manual check of a random sample of 100 records of the unfiltered query (seed 20260828), coded with AI assistance and reviewed by the authors, 61 percent of the records surviving the noise filter [Wilson 95 percent CI 51, 70] were UAV studies with an agricultural application, a further 31 percent contained a UAV in a non-agricultural role, and 8 percent were residual noise. In an early-period sample (2005–2015, n = 35 after filtering) the relevant share was 37 percent [23, 54]; the difference is significant (two-proportion z = 2.38, p = 0.017), because the early literature is dominated by generic UAV engineering papers that mention agriculture only as a prospective application. Absolute counts should therefore be read as query-matched OpenAlex records rather than exact counts of agricultural UAV studies; any precision-adjusted value (about 0.6 times the raw counts) is an estimate, not a corrected count, and the growth of the strictly agricultural output is, if anything, faster than the growth of the query series. A stricter query that also excludes ecological and forestry terms grows at 28.5 percent per year as well, so the trend conclusions are robust. Finally, all series jump in 2025 (the agricultural denominator by 26 percent), which is partly an indexing artefact; normalisation attenuates it and a sensitivity analysis without 2025 is reported.</w:t>
       </w:r>
     </w:p>
     <w:p>
@@ -1468,7 +1494,17 @@
       </w:r>
       <w:r>
         <w:rPr/>
-        <w:t xml:space="preserve"> weights recomputed and the weighted forecast recorded, giving 90 percent intervals that include both parameter and model uncertainty. Forecasts are reported for 2028, 2030, 2032 and 2035. The pipeline (ten MATLAB functions, no toolbox required, also executable in GNU Octave) was independently replicated in Python; parameter estimates and deviances agree to all reported digits.</w:t>
+        <w:t xml:space="preserve"> weights recomputed and the weighted forecast recorded, giving 90 percent intervals that include both parameter and model uncertainty. The reported model average is the median of this bootstrap distribution of weighted forecasts; because the weights are recomputed on every replicate, it is not identical to the QAIC</w:t>
+      </w:r>
+      <w:r>
+        <w:rPr>
+          <w:vertAlign w:val="subscript"/>
+        </w:rPr>
+        <w:t xml:space="preserve">c</w:t>
+      </w:r>
+      <w:r>
+        <w:rPr/>
+        <w:t xml:space="preserve">-weighted combination of the point forecasts in Tables I and II, and the difference grows with the horizon. Backtest errors are reported per origin as well as averaged, the origins corresponding to seven-, five- and three-year evaluation horizons. Forecasts are reported for 2028, 2030, 2032 and 2035. The pipeline (ten MATLAB functions, no toolbox required, also executable in GNU Octave) was independently replicated in Python; parameter estimates and deviances agree to all reported digits.</w:t>
       </w:r>
     </w:p>
     <w:p>
@@ -1665,7 +1701,7 @@
       </w:r>
       <w:r>
         <w:rPr/>
-        <w:t xml:space="preserve"> weights range from 0.15 (Bass) to 0.39 (exponential), and, unlike in neighbouring observational domains, the exponential model receives the largest weight. The logistic model places the inflection point around 2030 with a capacity of about 21,000 articles per year — far above the current level — the Bass model peaks only in 2033, and the Gompertz fit degenerates towards an exponential shape. Backtesting gives MAPE of 28 to 34 percent over three origins, with the Gompertz model best from the 2022 origin (11 percent).</w:t>
+        <w:t xml:space="preserve"> weights range from 0.15 (Bass) to 0.39 (exponential), and, unlike in neighbouring observational domains, the exponential model receives the largest weight. The logistic model places the inflection point around 2030 with a capacity of about 21,000 articles per year — far above the current level — the Bass model peaks only in 2033, and the Gompertz fit degenerates towards an exponential shape. By origin, backtest MAPE is 32–33 percent from 2018 (seven remaining years), 43–44 percent from 2020 and 11–26 percent from 2022 (three remaining years), every window containing the partly artefactual 2025 value; the Gompertz model is best from the most recent origin (11 percent) and the averages over origins are 28–34 percent.</w:t>
       </w:r>
     </w:p>
     <w:p>
@@ -2596,7 +2632,7 @@
       </w:pPr>
       <w:r>
         <w:rPr/>
-        <w:t xml:space="preserve">Fig. 2 shows the fits and the forecasts and Table II lists them. The models agree for the three-year horizon (7,260 to 8,850 articles in 2028; model average 8,174 [90 percent interval 6,232, 9,304]) and diverge afterwards: in 2035 the point forecasts range from 12,380 (Bass) to 51,810 (exponential), the model average is 40,260 and the interval spans 13,390 to 55,050. The sensitivity analysis shows the familiar dependence on the last observation: without 2025 the logistic capacity falls to about 5,300 and the Bass model predicts a decline, so a single year, partly an indexing artefact, again determines the estimated ceiling.</w:t>
+        <w:t xml:space="preserve">Fig. 2 shows the fits and the forecasts and Table II lists them. The models agree for the three-year horizon (7,260 to 8,850 articles in 2028; model average 8,237 [90 percent interval 6,422, 9,457]) and diverge afterwards: in 2035 the point forecasts range from 12,380 (Bass) to 51,810 (exponential). The full model average reaches 40,261 [14,213–55,954], but at this horizon it leans on the exponential model, which the share analysis contradicts; Table II therefore also lists the average of the three saturating models (renormalised weights 0.27, 0.48 and 0.25), which reaches 24,023 articles in 2035 [6,570–52,895] and is the long-horizon count forecast used in the rest of the paper. The sensitivity analysis shows the familiar dependence on the last observation: without 2025 the logistic capacity falls to about 5,400 and the Bass model places its peak already in 2027, so a single year, partly an indexing artefact, again determines the estimated ceiling.</w:t>
       </w:r>
     </w:p>
     <w:p>
@@ -2611,7 +2647,7 @@
         <w:rPr/>
         <w:drawing>
           <wp:inline distT="0" distB="0" distL="0" distR="0">
-            <wp:extent cx="3007360" cy="2391394"/>
+            <wp:extent cx="3007360" cy="2392579"/>
             <wp:effectExtent l="0" t="0" r="0" b="0"/>
             <wp:docPr id="12" name="image2.png"/>
             <wp:cNvGraphicFramePr>
@@ -2633,7 +2669,7 @@
                   <pic:spPr>
                     <a:xfrm>
                       <a:off x="0" y="0"/>
-                      <a:ext cx="3007360" cy="2391394"/>
+                      <a:ext cx="3007360" cy="2392579"/>
                     </a:xfrm>
                     <a:prstGeom prst="rect">
                       <a:avLst/>
@@ -3358,7 +3394,7 @@
                 <w:b/>
                 <w:bCs/>
               </w:rPr>
-              <w:t xml:space="preserve">8,174</w:t>
+              <w:t xml:space="preserve">8,237</w:t>
             </w:r>
           </w:p>
         </w:tc>
@@ -3384,7 +3420,7 @@
                 <w:b/>
                 <w:bCs/>
               </w:rPr>
-              <w:t xml:space="preserve">13,000</w:t>
+              <w:t xml:space="preserve">13,069</w:t>
             </w:r>
           </w:p>
         </w:tc>
@@ -3410,7 +3446,7 @@
                 <w:b/>
                 <w:bCs/>
               </w:rPr>
-              <w:t xml:space="preserve">20,440</w:t>
+              <w:t xml:space="preserve">20,534</w:t>
             </w:r>
           </w:p>
         </w:tc>
@@ -3436,7 +3472,7 @@
                 <w:b/>
                 <w:bCs/>
               </w:rPr>
-              <w:t xml:space="preserve">40,260</w:t>
+              <w:t xml:space="preserve">40,261</w:t>
             </w:r>
           </w:p>
         </w:tc>
@@ -3487,7 +3523,7 @@
             </w:pPr>
             <w:r>
               <w:rPr/>
-              <w:t xml:space="preserve">6,232–9,304</w:t>
+              <w:t xml:space="preserve">6,422–9,457</w:t>
             </w:r>
           </w:p>
         </w:tc>
@@ -3510,7 +3546,7 @@
             </w:pPr>
             <w:r>
               <w:rPr/>
-              <w:t xml:space="preserve">8,012–15,430</w:t>
+              <w:t xml:space="preserve">8,523–15,673</w:t>
             </w:r>
           </w:p>
         </w:tc>
@@ -3533,7 +3569,7 @@
             </w:pPr>
             <w:r>
               <w:rPr/>
-              <w:t xml:space="preserve">10,040–25,670</w:t>
+              <w:t xml:space="preserve">10,910–25,949</w:t>
             </w:r>
           </w:p>
         </w:tc>
@@ -3556,7 +3592,262 @@
             </w:pPr>
             <w:r>
               <w:rPr/>
-              <w:t xml:space="preserve">13,390–55,050</w:t>
+              <w:t xml:space="preserve">14,213–55,954</w:t>
+            </w:r>
+          </w:p>
+        </w:tc>
+      </w:tr>
+      <w:tr>
+        <w:trPr>
+          <w:cantSplit w:val="true"/>
+        </w:trPr>
+        <w:tc>
+          <w:tcPr>
+            <w:tcW w:w="1000" w:type="dxa"/>
+            <w:tcBorders>
+              <w:top w:val="single" w:sz="2" w:space="0" w:color="000000"/>
+              <w:start w:val="single" w:sz="2" w:space="0" w:color="000000"/>
+              <w:bottom w:val="single" w:sz="2" w:space="0" w:color="000000"/>
+              <w:end w:val="single" w:sz="2" w:space="0" w:color="000000"/>
+            </w:tcBorders>
+            <w:vAlign w:val="center"/>
+          </w:tcPr>
+          <w:p>
+            <w:pPr>
+              <w:pStyle w:val="tablecopy"/>
+              <w:jc w:val="left"/>
+              <w:rPr/>
+            </w:pPr>
+            <w:r>
+              <w:rPr>
+                <w:b/>
+                <w:bCs/>
+              </w:rPr>
+              <w:t xml:space="preserve">Saturating average</w:t>
+            </w:r>
+          </w:p>
+        </w:tc>
+        <w:tc>
+          <w:tcPr>
+            <w:tcW w:w="934" w:type="dxa"/>
+            <w:tcBorders>
+              <w:top w:val="single" w:sz="2" w:space="0" w:color="000000"/>
+              <w:start w:val="single" w:sz="2" w:space="0" w:color="000000"/>
+              <w:bottom w:val="single" w:sz="2" w:space="0" w:color="000000"/>
+              <w:end w:val="single" w:sz="2" w:space="0" w:color="000000"/>
+            </w:tcBorders>
+            <w:vAlign w:val="center"/>
+          </w:tcPr>
+          <w:p>
+            <w:pPr>
+              <w:pStyle w:val="tablecopy"/>
+              <w:jc w:val="center"/>
+              <w:rPr/>
+            </w:pPr>
+            <w:r>
+              <w:rPr>
+                <w:b/>
+                <w:bCs/>
+              </w:rPr>
+              <w:t xml:space="preserve">7,505</w:t>
+            </w:r>
+          </w:p>
+        </w:tc>
+        <w:tc>
+          <w:tcPr>
+            <w:tcW w:w="934" w:type="dxa"/>
+            <w:tcBorders>
+              <w:top w:val="single" w:sz="2" w:space="0" w:color="000000"/>
+              <w:start w:val="single" w:sz="2" w:space="0" w:color="000000"/>
+              <w:bottom w:val="single" w:sz="2" w:space="0" w:color="000000"/>
+              <w:end w:val="single" w:sz="2" w:space="0" w:color="000000"/>
+            </w:tcBorders>
+            <w:vAlign w:val="center"/>
+          </w:tcPr>
+          <w:p>
+            <w:pPr>
+              <w:pStyle w:val="tablecopy"/>
+              <w:jc w:val="center"/>
+              <w:rPr/>
+            </w:pPr>
+            <w:r>
+              <w:rPr>
+                <w:b/>
+                <w:bCs/>
+              </w:rPr>
+              <w:t xml:space="preserve">10,874</w:t>
+            </w:r>
+          </w:p>
+        </w:tc>
+        <w:tc>
+          <w:tcPr>
+            <w:tcW w:w="934" w:type="dxa"/>
+            <w:tcBorders>
+              <w:top w:val="single" w:sz="2" w:space="0" w:color="000000"/>
+              <w:start w:val="single" w:sz="2" w:space="0" w:color="000000"/>
+              <w:bottom w:val="single" w:sz="2" w:space="0" w:color="000000"/>
+              <w:end w:val="single" w:sz="2" w:space="0" w:color="000000"/>
+            </w:tcBorders>
+            <w:vAlign w:val="center"/>
+          </w:tcPr>
+          <w:p>
+            <w:pPr>
+              <w:pStyle w:val="tablecopy"/>
+              <w:jc w:val="center"/>
+              <w:rPr/>
+            </w:pPr>
+            <w:r>
+              <w:rPr>
+                <w:b/>
+                <w:bCs/>
+              </w:rPr>
+              <w:t xml:space="preserve">15,250</w:t>
+            </w:r>
+          </w:p>
+        </w:tc>
+        <w:tc>
+          <w:tcPr>
+            <w:tcW w:w="934" w:type="dxa"/>
+            <w:tcBorders>
+              <w:top w:val="single" w:sz="2" w:space="0" w:color="000000"/>
+              <w:start w:val="single" w:sz="2" w:space="0" w:color="000000"/>
+              <w:bottom w:val="single" w:sz="2" w:space="0" w:color="000000"/>
+              <w:end w:val="single" w:sz="2" w:space="0" w:color="000000"/>
+            </w:tcBorders>
+            <w:vAlign w:val="center"/>
+          </w:tcPr>
+          <w:p>
+            <w:pPr>
+              <w:pStyle w:val="tablecopy"/>
+              <w:jc w:val="center"/>
+              <w:rPr/>
+            </w:pPr>
+            <w:r>
+              <w:rPr>
+                <w:b/>
+                <w:bCs/>
+              </w:rPr>
+              <w:t xml:space="preserve">24,023</w:t>
+            </w:r>
+          </w:p>
+        </w:tc>
+      </w:tr>
+      <w:tr>
+        <w:trPr>
+          <w:cantSplit w:val="true"/>
+        </w:trPr>
+        <w:tc>
+          <w:tcPr>
+            <w:tcW w:w="1000" w:type="dxa"/>
+            <w:tcBorders>
+              <w:top w:val="single" w:sz="2" w:space="0" w:color="000000"/>
+              <w:start w:val="single" w:sz="2" w:space="0" w:color="000000"/>
+              <w:bottom w:val="single" w:sz="2" w:space="0" w:color="000000"/>
+              <w:end w:val="single" w:sz="2" w:space="0" w:color="000000"/>
+            </w:tcBorders>
+            <w:vAlign w:val="center"/>
+          </w:tcPr>
+          <w:p>
+            <w:pPr>
+              <w:pStyle w:val="tablecopy"/>
+              <w:jc w:val="left"/>
+              <w:rPr/>
+            </w:pPr>
+            <w:r>
+              <w:rPr/>
+              <w:t xml:space="preserve">90 % interval</w:t>
+            </w:r>
+          </w:p>
+        </w:tc>
+        <w:tc>
+          <w:tcPr>
+            <w:tcW w:w="934" w:type="dxa"/>
+            <w:tcBorders>
+              <w:top w:val="single" w:sz="2" w:space="0" w:color="000000"/>
+              <w:start w:val="single" w:sz="2" w:space="0" w:color="000000"/>
+              <w:bottom w:val="single" w:sz="2" w:space="0" w:color="000000"/>
+              <w:end w:val="single" w:sz="2" w:space="0" w:color="000000"/>
+            </w:tcBorders>
+            <w:vAlign w:val="center"/>
+          </w:tcPr>
+          <w:p>
+            <w:pPr>
+              <w:pStyle w:val="tablecopy"/>
+              <w:jc w:val="center"/>
+              <w:rPr/>
+            </w:pPr>
+            <w:r>
+              <w:rPr/>
+              <w:t xml:space="preserve">5,660–9,183</w:t>
+            </w:r>
+          </w:p>
+        </w:tc>
+        <w:tc>
+          <w:tcPr>
+            <w:tcW w:w="934" w:type="dxa"/>
+            <w:tcBorders>
+              <w:top w:val="single" w:sz="2" w:space="0" w:color="000000"/>
+              <w:start w:val="single" w:sz="2" w:space="0" w:color="000000"/>
+              <w:bottom w:val="single" w:sz="2" w:space="0" w:color="000000"/>
+              <w:end w:val="single" w:sz="2" w:space="0" w:color="000000"/>
+            </w:tcBorders>
+            <w:vAlign w:val="center"/>
+          </w:tcPr>
+          <w:p>
+            <w:pPr>
+              <w:pStyle w:val="tablecopy"/>
+              <w:jc w:val="center"/>
+              <w:rPr/>
+            </w:pPr>
+            <w:r>
+              <w:rPr/>
+              <w:t xml:space="preserve">6,775–15,191</w:t>
+            </w:r>
+          </w:p>
+        </w:tc>
+        <w:tc>
+          <w:tcPr>
+            <w:tcW w:w="934" w:type="dxa"/>
+            <w:tcBorders>
+              <w:top w:val="single" w:sz="2" w:space="0" w:color="000000"/>
+              <w:start w:val="single" w:sz="2" w:space="0" w:color="000000"/>
+              <w:bottom w:val="single" w:sz="2" w:space="0" w:color="000000"/>
+              <w:end w:val="single" w:sz="2" w:space="0" w:color="000000"/>
+            </w:tcBorders>
+            <w:vAlign w:val="center"/>
+          </w:tcPr>
+          <w:p>
+            <w:pPr>
+              <w:pStyle w:val="tablecopy"/>
+              <w:jc w:val="center"/>
+              <w:rPr/>
+            </w:pPr>
+            <w:r>
+              <w:rPr/>
+              <w:t xml:space="preserve">7,159–25,087</w:t>
+            </w:r>
+          </w:p>
+        </w:tc>
+        <w:tc>
+          <w:tcPr>
+            <w:tcW w:w="934" w:type="dxa"/>
+            <w:tcBorders>
+              <w:top w:val="single" w:sz="2" w:space="0" w:color="000000"/>
+              <w:start w:val="single" w:sz="2" w:space="0" w:color="000000"/>
+              <w:bottom w:val="single" w:sz="2" w:space="0" w:color="000000"/>
+              <w:end w:val="single" w:sz="2" w:space="0" w:color="000000"/>
+            </w:tcBorders>
+            <w:vAlign w:val="center"/>
+          </w:tcPr>
+          <w:p>
+            <w:pPr>
+              <w:pStyle w:val="tablecopy"/>
+              <w:jc w:val="center"/>
+              <w:rPr/>
+            </w:pPr>
+            <w:r>
+              <w:rPr/>
+              <w:t xml:space="preserve">6,570–52,895</w:t>
             </w:r>
           </w:p>
         </w:tc>
@@ -3609,7 +3900,7 @@
       </w:r>
       <w:r>
         <w:rPr/>
-        <w:t xml:space="preserve"> = 13.8 articles per 1,000 agricultural articles with the inflection in 2023–2024. The share observed in 2025, 8.5 per 1,000, is 62 percent of that plateau — agriculture is thus visibly earlier on the adoption curve than ecology and environmental monitoring, where the same methodology finds 85 percent of the plateau already reached. The model-averaged forecast is 12.6 per 1,000 in 2028 [10.9, 14.6], 15.8 in 2030 [12.5, 20.3] and 26.4 in 2035 [16.0, 46.9], where the wide upper tail comes from the residual weight of the Gompertz curve. Backtesting from the 2022 origin gives a MAPE of 7.6 percent for the logistic model against 28.5 percent for the exponential one.</w:t>
+        <w:t xml:space="preserve"> = 13.8 articles per 1,000 agricultural articles with the inflection in 2023–2024. The share observed in 2025, 8.5 per 1,000, is 62 percent of that plateau — agriculture is thus visibly earlier on the adoption curve than ecology and environmental monitoring, where the same methodology finds 85 percent of the plateau already reached. The model-averaged forecast is 12.5 per 1,000 in 2028 [10.9, 14.8], 15.7 in 2030 [12.5, 20.5] and 26.0 in 2035 [16.0, 47.8], where the wide upper tail comes from the residual weight of the Gompertz curve. Backtesting from the 2022 origin gives a MAPE of 7.6 percent for the logistic model against 28.5 percent for the exponential one. The saturating shape is robust, its level less so. Refitted on 2005–2024, the logistic model still dominates (weight 0.95) with the inflection unchanged, but the plateau falls from 13.8 to 11.6 per 1,000, of which 64 percent had been reached by 2024: the position near three fifths of the curve is stable, the ceiling itself is provisional. Under the broader denominators the logistic model also dominates — field Agricultural and Biological Sciences: weight 0.87, plateau 28.9 per 1,000, inflection 2026, 42 percent reached; all indexed works: weight 0.80, plateau 1.59 per 1,000, inflection 2027, 38 percent reached — which confirms that agriculture is still on the steep part of the curve. Only under the narrow Agronomy and Crop Science subfield, where UAV articles already make up 222 per 1,000 and drive the denominator itself, can the data not yet separate the three shapes (weights 0.27–0.43).</w:t>
       </w:r>
     </w:p>
     <w:p>
@@ -3624,7 +3915,7 @@
         <w:rPr/>
         <w:drawing>
           <wp:inline distT="0" distB="0" distL="0" distR="0">
-            <wp:extent cx="3007360" cy="2391394"/>
+            <wp:extent cx="3007360" cy="2392579"/>
             <wp:effectExtent l="0" t="0" r="0" b="0"/>
             <wp:docPr id="13" name="image3.png"/>
             <wp:cNvGraphicFramePr>
@@ -3646,7 +3937,7 @@
                   <pic:spPr>
                     <a:xfrm>
                       <a:off x="0" y="0"/>
-                      <a:ext cx="3007360" cy="2391394"/>
+                      <a:ext cx="3007360" cy="2392579"/>
                     </a:xfrm>
                     <a:prstGeom prst="rect">
                       <a:avLst/>
@@ -4514,7 +4805,7 @@
       </w:pPr>
       <w:r>
         <w:rPr/>
-        <w:t xml:space="preserve">Three findings frame the interpretation. First, the reliable forecast horizon for absolute output is again about three years; by 2035 the choice of curve dominates any statistical uncertainty. Second, the share analysis indicates that UAVs in agriculture are still in the steep part of the adoption curve: at 62 percent of the estimated plateau, with the inflection dated only 2023–2024, the field has more headroom than neighbouring observational domains. Third, the sub-domain ranking shows where that headroom lies: the fastest growth is in data-driven agronomy — yield prediction, irrigation scheduling and disease detection — rather than in the mapping applications that dominated the first decade.</w:t>
+        <w:t xml:space="preserve">Three findings frame the interpretation. First, the reliable forecast horizon for absolute output is again about three years — backtest errors from the most recent origin are a third to a half of those at the five- and seven-year origins — and beyond it the two forecasting approaches agree once the exponential model is set aside: if the agricultural literature continues at its 2015–2024 growth of 4.7 percent per year, the share forecast implies roughly 13,000–38,800 articles in 2035, bracketing the saturating-model average of 24,023 in Table II, whereas the exponential count model would imply a six- to sevenfold rise in share and is contradicted by the share analysis. Second, the share analysis indicates that UAVs in agriculture are still in the steep part of the adoption curve: at 62 percent of the estimated plateau, with the inflection dated only 2023–2024, the field has more headroom than neighbouring observational domains. Third, the sub-domain ranking shows where that headroom lies: the fastest growth is in data-driven agronomy — yield prediction, irrigation scheduling and disease detection — rather than in the mapping applications that dominated the first decade.</w:t>
       </w:r>
     </w:p>
     <w:p>
@@ -4594,7 +4885,7 @@
       </w:pPr>
       <w:r>
         <w:rPr/>
-        <w:t xml:space="preserve">A reproducible bibliometric series shows that research on UAVs in agriculture grew by 28.5 percent per year between 2005 and 2025, with a structural acceleration in 2009, and that its share of the agricultural literature is heading towards a plateau of about 14 articles per 1,000 of which less than two thirds has been reached — the field sits on the same adoption curve as neighbouring environmental applications, measured with the identical instrument, but shifted about four years later [20]. Four growth models agree on a three-year forecast of roughly 8,200 articles in 2028 but diverge widely by 2035. Growth is migrating from mapping towards data-driven agronomy and towards actuation, where payloads, precision application and regulation, rather than sensors, are the open problems. The data, the query definitions and the code are provided with this paper so that the analysis can be repeated at any future retrieval date.</w:t>
+        <w:t xml:space="preserve">A reproducible bibliometric series shows that research on UAVs in agriculture grew by 28.5 percent per year between 2005 and 2025, with a structural acceleration in 2009, and that its share of the agricultural literature is heading towards a plateau of about 14 articles per 1,000 of which less than two thirds has been reached — the field sits on the same adoption curve as neighbouring environmental applications, measured with the identical instrument, but shifted about four years later [20]. Four growth models agree on a three-year forecast of roughly 8,200 articles in 2028; over ten years the forecast consistent with the share analysis — the average of the saturating models — reaches about 24,000 articles in 2035, with a wide interval. Growth is migrating from mapping towards data-driven agronomy and towards actuation, where payloads, precision application and regulation, rather than sensors, are the open problems. The data, the query definitions and the code are provided with this paper so that the analysis can be repeated at any future retrieval date.</w:t>
       </w:r>
     </w:p>
     <w:p>

</xml_diff>

<commit_message>
Add Zenodo DOI 10.5281/zenodo.22172737: badge and citation in README, doi in CITATION.cff, new self-citation [21] in the paper (EN+HR rebuilt, 6 pp each)
Co-Authored-By: Claude Fable 5 <noreply@anthropic.com>
Claude-Session: https://claude.ai/code/session_01DHGVPkToAeprTfin5ugPdx
</commit_message>
<xml_diff>
--- a/paper/MIPRO_Drones_Agriculture_Forecast.docx
+++ b/paper/MIPRO_Drones_Agriculture_Forecast.docx
@@ -171,7 +171,7 @@
       </w:pPr>
       <w:r>
         <w:rPr/>
-        <w:t xml:space="preserve">This paper answers both questions with a reproducible bibliometric time series and a transparent forecasting pipeline, applying the methodology we developed for UAVs in ecology and environmental monitoring [20] to the agricultural domain. Our contributions are: (i) an openly queryable annual data set (2005–2025) of UAV research in agriculture, with a documented noise filter, four denominators and seven application sub-domains, built from the OpenAlex index [4]; (ii) a description of the current state of the field, including trend tests, a structural break and the distribution of output over sub-domains, countries and venues; (iii) a MATLAB algorithm, free of toolbox dependencies, that fits and compares four classical growth models, validates them out of sample and produces bootstrapped forecasts for 3, 5, 7 and 10-year horizons; (iv) the first like-for-like comparison of two application domains — agriculture and environmental monitoring — measured with the identical query protocol, index and pipeline on the same day; and (v) a discussion of what the forecasts mean for UAV engineers, including the actuation role that distinguishes agriculture from purely observational domains.</w:t>
+        <w:t xml:space="preserve">This paper answers both questions with a reproducible bibliometric time series and a transparent forecasting pipeline, applying the methodology we developed for UAVs in ecology and environmental monitoring [20] to the agricultural domain. Our contributions are: (i) an openly queryable annual data set (2005–2025) of UAV research in agriculture, with a documented noise filter, four denominators and seven application sub-domains, built from the OpenAlex index [4]; (ii) a description of the current state of the field, including trend tests, a structural break and the distribution of output over sub-domains, countries and venues; (iii) a MATLAB algorithm, free of toolbox dependencies, that fits and compares four classical growth models, validates them out of sample and produces bootstrapped forecasts for 3, 5, 7 and 10-year horizons, openly archived together with the data set [21]; (iv) the first like-for-like comparison of two application domains — agriculture and environmental monitoring — measured with the identical query protocol, index and pipeline on the same day; and (v) a discussion of what the forecasts mean for UAV engineers, including the actuation role that distinguishes agriculture from purely observational domains.</w:t>
       </w:r>
     </w:p>
     <w:p>
@@ -4885,7 +4885,7 @@
       </w:pPr>
       <w:r>
         <w:rPr/>
-        <w:t xml:space="preserve">A reproducible bibliometric series shows that research on UAVs in agriculture grew by 28.5 percent per year between 2005 and 2025, with a structural acceleration in 2009, and that its share of the agricultural literature is heading towards a plateau of about 14 articles per 1,000 of which less than two thirds has been reached — the field sits on the same adoption curve as neighbouring environmental applications, measured with the identical instrument, but shifted about four years later [20]. Four growth models agree on a three-year forecast of roughly 8,200 articles in 2028; over ten years the forecast consistent with the share analysis — the average of the saturating models — reaches about 24,000 articles in 2035, with a wide interval. Growth is migrating from mapping towards data-driven agronomy and towards actuation, where payloads, precision application and regulation, rather than sensors, are the open problems. The data, the query definitions and the code are provided with this paper so that the analysis can be repeated at any future retrieval date.</w:t>
+        <w:t xml:space="preserve">A reproducible bibliometric series shows that research on UAVs in agriculture grew by 28.5 percent per year between 2005 and 2025, with a structural acceleration in 2009, and that its share of the agricultural literature is heading towards a plateau of about 14 articles per 1,000 of which less than two thirds has been reached — the field sits on the same adoption curve as neighbouring environmental applications, measured with the identical instrument, but shifted about four years later [20]. Four growth models agree on a three-year forecast of roughly 8,200 articles in 2028; over ten years the forecast consistent with the share analysis — the average of the saturating models — reaches about 24,000 articles in 2035, with a wide interval. Growth is migrating from mapping towards data-driven agronomy and towards actuation, where payloads, precision application and regulation, rather than sensors, are the open problems. The data, the query definitions and the code are openly archived on Zenodo [21] so that the analysis can be repeated at any future retrieval date.</w:t>
       </w:r>
     </w:p>
     <w:p>
@@ -5425,6 +5425,21 @@
       <w:r>
         <w:rPr/>
         <w:t xml:space="preserve">V. Uroš and M. Jelić, "drone-ecology-forecast: bibliometric data and MATLAB growth-model pipeline for UAV research in ecology and environmental monitoring (v1.0)," Zenodo, 2026, doi: 10.5281/zenodo.22119199.</w:t>
+      </w:r>
+    </w:p>
+    <w:p>
+      <w:pPr>
+        <w:pStyle w:val="references"/>
+        <w:numPr>
+          <w:ilvl w:val="0"/>
+          <w:numId w:val="4"/>
+        </w:numPr>
+        <w:ind w:hanging="0" w:start="0"/>
+        <w:rPr/>
+      </w:pPr>
+      <w:r>
+        <w:rPr/>
+        <w:t xml:space="preserve">V. Uroš and M. Jelić, "drone-agriculture-forecast: bibliometric data and MATLAB growth-model pipeline for UAV research in agriculture (v1.1)," Zenodo, 2026, doi: 10.5281/zenodo.22172737.</w:t>
       </w:r>
     </w:p>
     <w:p>

</xml_diff>

<commit_message>
Cite Rejeb et al. 2022 (CompAg 198:107017) as ref [22]: closest bibliometric antecedent in Related Work, post-2010 surge cross-validation of the 2009 break in Results; EN+HR rebuilt, both 6 pp
Co-Authored-By: Claude Fable 5 <noreply@anthropic.com>
Claude-Session: https://claude.ai/code/session_01DHGVPkToAeprTfin5ugPdx
</commit_message>
<xml_diff>
--- a/paper/MIPRO_Drones_Agriculture_Forecast.docx
+++ b/paper/MIPRO_Drones_Agriculture_Forecast.docx
@@ -201,7 +201,7 @@
       </w:pPr>
       <w:r>
         <w:rPr/>
-        <w:t xml:space="preserve">Reviews of UAVs in precision agriculture converge on a common inventory of applications: crop growth and health monitoring with visible, multispectral, hyperspectral and thermal sensors; high-throughput field phenotyping; weed mapping for site-specific management; irrigation scheduling from canopy temperature and vegetation indices; disease and pest detection; yield estimation; and spraying [1], [2], [3], [6]. Early work already demonstrated the key building blocks: a UAV configured for early site-specific weed management [5], and multi-sensor data fusion that predicts soybean yield within a field from UAV imagery using deep learning [7]. Field-based phenotyping has become a discipline of its own, with UAVs replacing ground vehicles as the primary carrier [8]. Two recurring engineering caveats temper the enthusiasm: radiometric calibration and the gap between vegetation indices and agronomic variables limit transferability across fields and seasons [2], [9], and the economics of UAV operations only close at sufficient field sizes or service-provider models [9]. Spraying is the application in which the UAV stops being a sensor and becomes an actuator: adoption is led by East Asia, with more than 120,000 plant-protection drones operating in China and roughly 62 million hectares treated in 2021, and about a third of Japanese rice fields sprayed from unmanned helicopters as early as 2016 [17]; reviews document rapid progress but also open problems in droplet drift, deposition uniformity and dose control [6].</w:t>
+        <w:t xml:space="preserve">Reviews of UAVs in precision agriculture converge on a common inventory of applications: crop growth and health monitoring with visible, multispectral, hyperspectral and thermal sensors; high-throughput field phenotyping; weed mapping for site-specific management; irrigation scheduling from canopy temperature and vegetation indices; disease and pest detection; yield estimation; and spraying [1], [2], [3], [6]. Early work already demonstrated the key building blocks: a UAV configured for early site-specific weed management [5], and multi-sensor data fusion that predicts soybean yield within a field from UAV imagery using deep learning [7]. Field-based phenotyping has become a discipline of its own, with UAVs replacing ground vehicles as the primary carrier [8]. Two recurring engineering caveats temper the enthusiasm: radiometric calibration and the gap between vegetation indices and agronomic variables limit transferability across fields and seasons [2], [9], and the economics of UAV operations only close at sufficient field sizes or service-provider models [9]. Spraying is the application in which the UAV stops being a sensor and becomes an actuator: adoption is led by East Asia, with more than 120,000 plant-protection drones operating in China and roughly 62 million hectares treated in 2021, and about a third of Japanese rice fields sprayed from unmanned helicopters as early as 2016 [17]; reviews document rapid progress but also open problems in droplet drift, deposition uniformity and dose control [6]. The closest antecedent is the bibliometric review by Rejeb et al. [22]: from 4,700 Scopus documents to September 2021 they date the exponential surge after 2010, with a peak of 1,275 publications in 2020, and identify remote sensing, precision agriculture, deep and machine learning and the Internet of Things as its keyword hotspots in six co-citation clusters. That study maps the intellectual structure of the field but leaves its dynamics unmodelled — the gap this paper fills with growth curves on a normalised series and forecasts to 2035.</w:t>
       </w:r>
     </w:p>
     <w:p>
@@ -1599,7 +1599,7 @@
       </w:r>
       <w:r>
         <w:rPr/>
-        <w:t xml:space="preserve"> ≈ 0.018, approximate), coinciding with the arrival of low-cost multirotor platforms and consumer-grade multispectral cameras. Normalised by the agricultural literature, the share rose from 0.21 to 8.53 articles per 1,000 (Sen slope 0.38 per 1,000 per year [0.28, 0.47]); within the UAV literature as a whole, the agricultural fraction rose from 3.0 to 17.1 percent.</w:t>
+        <w:t xml:space="preserve"> ≈ 0.018, approximate), coinciding with the arrival of low-cost multirotor platforms and consumer-grade multispectral cameras, consistent with the post-2010 surge dated in [22]. Normalised by the agricultural literature, the share rose from 0.21 to 8.53 articles per 1,000 (Sen slope 0.38 per 1,000 per year [0.28, 0.47]); within the UAV literature as a whole, the agricultural fraction rose from 3.0 to 17.1 percent.</w:t>
       </w:r>
     </w:p>
     <w:p>
@@ -5440,6 +5440,32 @@
       <w:r>
         <w:rPr/>
         <w:t xml:space="preserve">V. Uroš and M. Jelić, "drone-agriculture-forecast: bibliometric data and MATLAB growth-model pipeline for UAV research in agriculture (v1.1)," Zenodo, 2026, doi: 10.5281/zenodo.22172737.</w:t>
+      </w:r>
+    </w:p>
+    <w:p>
+      <w:pPr>
+        <w:pStyle w:val="references"/>
+        <w:numPr>
+          <w:ilvl w:val="0"/>
+          <w:numId w:val="4"/>
+        </w:numPr>
+        <w:ind w:hanging="0" w:start="0"/>
+        <w:rPr/>
+      </w:pPr>
+      <w:r>
+        <w:rPr/>
+        <w:t xml:space="preserve">A. Rejeb, A. Abdollahi, K. Rejeb, and H. Treiblmaier, "Drones in agriculture: A review and bibliometric analysis," </w:t>
+      </w:r>
+      <w:r>
+        <w:rPr>
+          <w:i/>
+          <w:iCs/>
+        </w:rPr>
+        <w:t xml:space="preserve">Computers and Electronics in Agriculture</w:t>
+      </w:r>
+      <w:r>
+        <w:rPr/>
+        <w:t xml:space="preserve">, vol. 198, art. 107017, 2022.</w:t>
       </w:r>
     </w:p>
     <w:p>

</xml_diff>